<commit_message>
Subí mal la documentación
</commit_message>
<xml_diff>
--- a/Actividad1_Plantilla.docx
+++ b/Actividad1_Plantilla.docx
@@ -2858,7 +2858,7 @@
           </w:tcPr>
           <w:p>
             <w:r>
-              <w:t>Un SIEM no es una herramienta reactiva tras el desastre. De haber contado con reglas de correlación para inicios de sesión atípicos, monitoreo de tráfico de salida masivo e integración de respuesta automática, Colonial Pipeline pudo haber detectado la presencia del afiliado en los primeros días de su incursión, revocando el acceso a la VPN y evitando el robo de 100 GB como la paralización de sus operaciones.</w:t>
+              <w:t>De haber contado con reglas de correlación para inicios de sesión atípicos, monitoreo de tráfico de salida masivo e integración de respuesta automática, Colonial Pipeline pudo haber detectado la presencia del afiliado en los primeros días de su incursión, revocando el acceso a la VPN y evitando el robo de 100 GB como la paralización de sus operaciones.</w:t>
             </w:r>
           </w:p>
         </w:tc>
@@ -3058,7 +3058,11 @@
             </w:tcMar>
             <w:vAlign w:val="center"/>
           </w:tcPr>
-          <w:p/>
+          <w:p>
+            <w:r>
+              <w:t>V</w:t>
+            </w:r>
+          </w:p>
         </w:tc>
       </w:tr>
       <w:tr>
@@ -3127,7 +3131,11 @@
             </w:tcMar>
             <w:vAlign w:val="center"/>
           </w:tcPr>
-          <w:p/>
+          <w:p>
+            <w:r>
+              <w:t>V</w:t>
+            </w:r>
+          </w:p>
         </w:tc>
       </w:tr>
       <w:tr>
@@ -3196,7 +3204,11 @@
             </w:tcMar>
             <w:vAlign w:val="center"/>
           </w:tcPr>
-          <w:p/>
+          <w:p>
+            <w:r>
+              <w:t>V</w:t>
+            </w:r>
+          </w:p>
         </w:tc>
       </w:tr>
       <w:tr>
@@ -3265,7 +3277,11 @@
             </w:tcMar>
             <w:vAlign w:val="center"/>
           </w:tcPr>
-          <w:p/>
+          <w:p>
+            <w:r>
+              <w:t>V</w:t>
+            </w:r>
+          </w:p>
         </w:tc>
       </w:tr>
     </w:tbl>
@@ -3327,14 +3343,63 @@
           </w:tcPr>
           <w:p>
             <w:r>
-              <w:rPr>
-                <w:i/>
-                <w:iCs/>
-                <w:color w:val="8694A8"/>
-                <w:sz w:val="19"/>
-                <w:szCs w:val="19"/>
-              </w:rPr>
-              <w:t>Pega aquí tu diagrama (exportado de draw.io o Lucidchart).</w:t>
+              <w:drawing>
+                <wp:anchor distT="0" distB="0" distL="114300" distR="114300" simplePos="0" relativeHeight="251658240" behindDoc="1" locked="0" layoutInCell="1" allowOverlap="1" wp14:anchorId="53A61B52" wp14:editId="42EAC602">
+                  <wp:simplePos x="0" y="0"/>
+                  <wp:positionH relativeFrom="column">
+                    <wp:posOffset>-22225</wp:posOffset>
+                  </wp:positionH>
+                  <wp:positionV relativeFrom="paragraph">
+                    <wp:posOffset>419100</wp:posOffset>
+                  </wp:positionV>
+                  <wp:extent cx="5778500" cy="514350"/>
+                  <wp:effectExtent l="0" t="0" r="0" b="0"/>
+                  <wp:wrapTight wrapText="bothSides">
+                    <wp:wrapPolygon edited="0">
+                      <wp:start x="0" y="0"/>
+                      <wp:lineTo x="0" y="20800"/>
+                      <wp:lineTo x="21505" y="20800"/>
+                      <wp:lineTo x="21505" y="0"/>
+                      <wp:lineTo x="0" y="0"/>
+                    </wp:wrapPolygon>
+                  </wp:wrapTight>
+                  <wp:docPr id="1284359424" name="Imagen 1"/>
+                  <wp:cNvGraphicFramePr>
+                    <a:graphicFrameLocks xmlns:a="http://schemas.openxmlformats.org/drawingml/2006/main" noChangeAspect="1"/>
+                  </wp:cNvGraphicFramePr>
+                  <a:graphic xmlns:a="http://schemas.openxmlformats.org/drawingml/2006/main">
+                    <a:graphicData uri="http://schemas.openxmlformats.org/drawingml/2006/picture">
+                      <pic:pic xmlns:pic="http://schemas.openxmlformats.org/drawingml/2006/picture">
+                        <pic:nvPicPr>
+                          <pic:cNvPr id="1284359424" name=""/>
+                          <pic:cNvPicPr/>
+                        </pic:nvPicPr>
+                        <pic:blipFill>
+                          <a:blip r:embed="rId14">
+                            <a:extLst>
+                              <a:ext uri="{28A0092B-C50C-407E-A947-70E740481C1C}">
+                                <a14:useLocalDpi xmlns:a14="http://schemas.microsoft.com/office/drawing/2010/main" val="0"/>
+                              </a:ext>
+                            </a:extLst>
+                          </a:blip>
+                          <a:stretch>
+                            <a:fillRect/>
+                          </a:stretch>
+                        </pic:blipFill>
+                        <pic:spPr>
+                          <a:xfrm>
+                            <a:off x="0" y="0"/>
+                            <a:ext cx="5778500" cy="514350"/>
+                          </a:xfrm>
+                          <a:prstGeom prst="rect">
+                            <a:avLst/>
+                          </a:prstGeom>
+                        </pic:spPr>
+                      </pic:pic>
+                    </a:graphicData>
+                  </a:graphic>
+                </wp:anchor>
+              </w:drawing>
             </w:r>
           </w:p>
         </w:tc>
@@ -3399,13 +3464,10 @@
           <w:p>
             <w:r>
               <w:rPr>
-                <w:i/>
-                <w:iCs/>
-                <w:color w:val="8694A8"/>
                 <w:sz w:val="19"/>
                 <w:szCs w:val="19"/>
               </w:rPr>
-              <w:t>¿Qué aprendiste del caso? ¿Qué harías distinto para prevenirlo o responder mejor?</w:t>
+              <w:t>En retrospectiva, el problema radicaba por una cuenta de VPN en desuso, por lo que esto sirvió como exploit para los atacantes. Y bien, de lo que puedo aprender es que: no siempre lo simple es inofensivo, una cuenta olvidada y desprotegida fue lo suficiente para causar desorden operativa y social; lo digital puede tener consecuencias, como las operaciones se vieron afectadas, la relación con el cliente final se vio comprometido por la escasez de gasolina debido a la detención preventiva; y a pesar de que la situación de calmó, aún así fue poco prudente financiar un crimen, así que en lugar de eso mejor usar un SIEM y medidas preventivas para evitar la pena de financiar grupos externos.</w:t>
             </w:r>
           </w:p>
         </w:tc>
@@ -3417,8 +3479,6 @@
           <w:bottom w:val="single" w:sz="8" w:space="3" w:color="E8532A"/>
         </w:pBdr>
         <w:spacing w:before="300" w:after="130"/>
-      </w:pPr>
-      <w:r>
         <w:rPr>
           <w:b/>
           <w:bCs/>
@@ -3426,6 +3486,46 @@
           <w:sz w:val="26"/>
           <w:szCs w:val="26"/>
         </w:rPr>
+      </w:pPr>
+    </w:p>
+    <w:p>
+      <w:pPr>
+        <w:pBdr>
+          <w:bottom w:val="single" w:sz="8" w:space="3" w:color="E8532A"/>
+        </w:pBdr>
+        <w:spacing w:before="300" w:after="130"/>
+        <w:rPr>
+          <w:b/>
+          <w:bCs/>
+          <w:color w:val="E8532A"/>
+          <w:sz w:val="26"/>
+          <w:szCs w:val="26"/>
+        </w:rPr>
+      </w:pPr>
+    </w:p>
+    <w:p>
+      <w:pPr>
+        <w:pBdr>
+          <w:bottom w:val="single" w:sz="8" w:space="3" w:color="E8532A"/>
+        </w:pBdr>
+        <w:spacing w:before="300" w:after="130"/>
+        <w:rPr>
+          <w:b/>
+          <w:bCs/>
+          <w:color w:val="E8532A"/>
+          <w:sz w:val="26"/>
+          <w:szCs w:val="26"/>
+        </w:rPr>
+      </w:pPr>
+      <w:r>
+        <w:rPr>
+          <w:b/>
+          <w:bCs/>
+          <w:color w:val="E8532A"/>
+          <w:sz w:val="26"/>
+          <w:szCs w:val="26"/>
+        </w:rPr>
+        <w:lastRenderedPageBreak/>
         <w:t xml:space="preserve">★   </w:t>
       </w:r>
       <w:r>
@@ -3512,7 +3612,6 @@
           <w:sz w:val="19"/>
           <w:szCs w:val="19"/>
         </w:rPr>
-        <w:lastRenderedPageBreak/>
         <w:t xml:space="preserve">TLP (semáforo de la info): </w:t>
       </w:r>
       <w:r>
@@ -3625,7 +3724,7 @@
       </w:r>
     </w:p>
     <w:sectPr>
-      <w:footerReference w:type="default" r:id="rId14"/>
+      <w:footerReference w:type="default" r:id="rId15"/>
       <w:pgSz w:w="12240" w:h="15840"/>
       <w:pgMar w:top="1200" w:right="1300" w:bottom="1200" w:left="1300" w:header="708" w:footer="708" w:gutter="0"/>
       <w:cols w:space="720"/>

</xml_diff>